<commit_message>
Use tonnes for erosion units in Figures S1-S3 and docs; update SI
Co-Authored-By: Claude Opus 5.5 <noreply@anthropic.com>
Claude-Session: https://claude.ai/code/session_017BdrnoRRqgC9iJ9Pknobuq
</commit_message>
<xml_diff>
--- a/docs/SupplementaryInformation.docx
+++ b/docs/SupplementaryInformation.docx
@@ -420,6 +420,11 @@
           <w:rStyle w:val="Strong"/>
         </w:rPr>
         <w:lastRenderedPageBreak/>
+      </w:r>
+      <w:r>
+        <w:rPr>
+          <w:rStyle w:val="Strong"/>
+        </w:rPr>
         <w:t>Calibration Figures</w:t>
       </w:r>
     </w:p>
@@ -442,7 +447,7 @@
         </w:rPr>
         <w:drawing>
           <wp:inline distT="0" distB="0" distL="0" distR="0">
-            <wp:extent cx="5029200" cy="2448118"/>
+            <wp:extent cx="5029200" cy="2502757"/>
             <wp:effectExtent l="0" t="0" r="0" b="0"/>
             <wp:docPr id="30" name="Picture 30"/>
             <wp:cNvGraphicFramePr>
@@ -464,7 +469,7 @@
                   <pic:spPr>
                     <a:xfrm>
                       <a:off x="0" y="0"/>
-                      <a:ext cx="5029200" cy="2448118"/>
+                      <a:ext cx="5029200" cy="2502757"/>
                     </a:xfrm>
                     <a:prstGeom prst="rect">
                       <a:avLst/>
@@ -563,7 +568,19 @@
         <w:rPr>
           <w:rFonts w:asciiTheme="majorHAnsi" w:hAnsiTheme="majorHAnsi" w:cstheme="majorHAnsi"/>
         </w:rPr>
-        <w:t xml:space="preserve"> = 0.78) subwatersheds in West Maui measured in metric tonnes per annum (T/yr). Given the limited number of watersheds (particularly ephemeral ones), R</w:t>
+        <w:t xml:space="preserve"> = 0.78) subwatersheds in West Maui </w:t>
+      </w:r>
+      <w:r>
+        <w:rPr>
+          <w:rFonts w:asciiTheme="majorHAnsi" w:hAnsiTheme="majorHAnsi" w:cstheme="majorHAnsi"/>
+        </w:rPr>
+        <w:t xml:space="preserve">measured in tonnes per year (tonnes/yr)</w:t>
+      </w:r>
+      <w:r>
+        <w:rPr>
+          <w:rFonts w:asciiTheme="majorHAnsi" w:hAnsiTheme="majorHAnsi" w:cstheme="majorHAnsi"/>
+        </w:rPr>
+        <w:t xml:space="preserve">. Given the limited number of watersheds (particularly ephemeral ones), R</w:t>
       </w:r>
       <w:r>
         <w:rPr>
@@ -664,6 +681,11 @@
           <w:noProof/>
         </w:rPr>
         <w:lastRenderedPageBreak/>
+      </w:r>
+      <w:r>
+        <w:rPr>
+          <w:noProof/>
+        </w:rPr>
         <w:drawing>
           <wp:inline distT="0" distB="0" distL="0" distR="0" wp14:anchorId="3127B096" wp14:editId="1737C604">
             <wp:extent cx="5238115" cy="3317875"/>
@@ -672,7 +694,7 @@
             <wp:cNvGraphicFramePr/>
             <a:graphic xmlns:a="http://schemas.openxmlformats.org/drawingml/2006/main">
               <a:graphicData uri="http://schemas.openxmlformats.org/drawingml/2006/chart">
-                <c:chart xmlns:c="http://schemas.openxmlformats.org/drawingml/2006/chart" xmlns:r="http://schemas.openxmlformats.org/officeDocument/2006/relationships" r:id="rId13"/>
+                <c:chart xmlns:c="http://schemas.openxmlformats.org/drawingml/2006/chart" r:id="rId13"/>
               </a:graphicData>
             </a:graphic>
           </wp:inline>
@@ -701,9 +723,14 @@
           <w:noProof/>
         </w:rPr>
         <w:lastRenderedPageBreak/>
+      </w:r>
+      <w:r>
+        <w:rPr>
+          <w:noProof/>
+        </w:rPr>
         <w:drawing>
           <wp:inline distT="0" distB="0" distL="0" distR="0">
-            <wp:extent cx="5486400" cy="2785403"/>
+            <wp:extent cx="5486400" cy="2710878"/>
             <wp:effectExtent l="0" t="0" r="0" b="0"/>
             <wp:docPr id="29" name="Picture 29"/>
             <wp:cNvGraphicFramePr>
@@ -725,7 +752,7 @@
                   <pic:spPr>
                     <a:xfrm>
                       <a:off x="0" y="0"/>
-                      <a:ext cx="5486400" cy="2785403"/>
+                      <a:ext cx="5486400" cy="2710878"/>
                     </a:xfrm>
                     <a:prstGeom prst="rect">
                       <a:avLst/>
@@ -797,7 +824,19 @@
         <w:rPr>
           <w:rFonts w:asciiTheme="majorHAnsi" w:hAnsiTheme="majorHAnsi" w:cstheme="majorHAnsi"/>
         </w:rPr>
-        <w:t>. Modeled bank erosion vs. watershed characteristics for perennial-intermittent watersheds. Watershed characteristics: A. mean susceptibility; B. # fill terrace cells; C. # pig disturbance only cells; D # road crossing &amp; multiple disturbance cells; E. watershed area (km2); F. mean annual precipitation (mm); G. total annual precipitation (mm).</w:t>
+        <w:t xml:space="preserve">. Modeled bank erosion vs. watershed characteristics for perennial-intermittent watersheds. Watershed characteristics: A. mean susceptibility; B. # fill terrace cells; C. # pig disturbance only cells; </w:t>
+      </w:r>
+      <w:r>
+        <w:rPr>
+          <w:rFonts w:asciiTheme="majorHAnsi" w:hAnsiTheme="majorHAnsi" w:cstheme="majorHAnsi"/>
+        </w:rPr>
+        <w:t xml:space="preserve">D. # road crossing &amp; multiple disturbance cells; E.</w:t>
+      </w:r>
+      <w:r>
+        <w:rPr>
+          <w:rFonts w:asciiTheme="majorHAnsi" w:hAnsiTheme="majorHAnsi" w:cstheme="majorHAnsi"/>
+        </w:rPr>
+        <w:t xml:space="preserve"> watershed area (km2); F. mean annual precipitation (mm); G. total annual precipitation (mm).</w:t>
       </w:r>
     </w:p>
     <w:p>
@@ -869,6 +908,11 @@
           <w:noProof/>
         </w:rPr>
         <w:lastRenderedPageBreak/>
+      </w:r>
+      <w:r>
+        <w:rPr>
+          <w:noProof/>
+        </w:rPr>
         <w:drawing>
           <wp:inline distT="0" distB="0" distL="0" distR="0" wp14:anchorId="0B44A9D1" wp14:editId="5B444265">
             <wp:extent cx="5099050" cy="2743200"/>
@@ -877,7 +921,7 @@
             <wp:cNvGraphicFramePr/>
             <a:graphic xmlns:a="http://schemas.openxmlformats.org/drawingml/2006/main">
               <a:graphicData uri="http://schemas.openxmlformats.org/drawingml/2006/chart">
-                <c:chart xmlns:c="http://schemas.openxmlformats.org/drawingml/2006/chart" xmlns:r="http://schemas.openxmlformats.org/officeDocument/2006/relationships" r:id="rId16"/>
+                <c:chart xmlns:c="http://schemas.openxmlformats.org/drawingml/2006/chart" r:id="rId16"/>
               </a:graphicData>
             </a:graphic>
           </wp:inline>
@@ -912,6 +956,11 @@
           <w:lang w:val="en-US"/>
         </w:rPr>
         <w:lastRenderedPageBreak/>
+      </w:r>
+      <w:r>
+        <w:rPr>
+          <w:lang w:val="en-US"/>
+        </w:rPr>
         <w:t>C.</w:t>
       </w:r>
     </w:p>
@@ -1013,6 +1062,11 @@
           <w:lang w:val="en-US"/>
         </w:rPr>
         <w:lastRenderedPageBreak/>
+      </w:r>
+      <w:r>
+        <w:rPr>
+          <w:lang w:val="en-US"/>
+        </w:rPr>
         <w:t>E.</w:t>
       </w:r>
     </w:p>
@@ -1114,6 +1168,11 @@
           <w:lang w:val="en-US"/>
         </w:rPr>
         <w:lastRenderedPageBreak/>
+      </w:r>
+      <w:r>
+        <w:rPr>
+          <w:lang w:val="en-US"/>
+        </w:rPr>
         <w:t>G.</w:t>
       </w:r>
     </w:p>
@@ -1168,9 +1227,14 @@
           <w:noProof/>
         </w:rPr>
         <w:lastRenderedPageBreak/>
+      </w:r>
+      <w:r>
+        <w:rPr>
+          <w:noProof/>
+        </w:rPr>
         <w:drawing>
           <wp:inline distT="0" distB="0" distL="0" distR="0">
-            <wp:extent cx="5486400" cy="2785403"/>
+            <wp:extent cx="5486400" cy="2710878"/>
             <wp:effectExtent l="0" t="0" r="0" b="0"/>
             <wp:docPr id="28" name="Picture 28"/>
             <wp:cNvGraphicFramePr>
@@ -1192,7 +1256,7 @@
                   <pic:spPr>
                     <a:xfrm>
                       <a:off x="0" y="0"/>
-                      <a:ext cx="5486400" cy="2785403"/>
+                      <a:ext cx="5486400" cy="2710878"/>
                     </a:xfrm>
                     <a:prstGeom prst="rect">
                       <a:avLst/>
@@ -1271,23 +1335,14 @@
           <w:rFonts w:asciiTheme="majorHAnsi" w:hAnsiTheme="majorHAnsi" w:cstheme="majorHAnsi"/>
           <w:lang w:val="en-US"/>
         </w:rPr>
-        <w:t>. Modeled bank erosion vs. watershed characteristics ephemeral watersheds A. vs. mean susceptibility, B. vs. # fill terrace cells, C. vs. # pig disturbance only cells. D # road crossing &amp; multiple disturbance cells, E. vs. watershed area (km2),</w:t>
+        <w:t xml:space="preserve">. </w:t>
       </w:r>
       <w:r>
         <w:rPr>
           <w:rFonts w:asciiTheme="majorHAnsi" w:hAnsiTheme="majorHAnsi" w:cstheme="majorHAnsi"/>
-          <w:sz w:val="28"/>
-          <w:szCs w:val="28"/>
           <w:lang w:val="en-US"/>
         </w:rPr>
-        <w:t xml:space="preserve"> F. </w:t>
-      </w:r>
-      <w:r>
-        <w:rPr>
-          <w:rFonts w:asciiTheme="majorHAnsi" w:hAnsiTheme="majorHAnsi" w:cstheme="majorHAnsi"/>
-          <w:lang w:val="en-US"/>
-        </w:rPr>
-        <w:t>vs. mean annual precipitation (mm), G. vs. vs. total annual precipitation (mm).</w:t>
+        <w:t xml:space="preserve">Modeled bank erosion vs. watershed characteristics for ephemeral watersheds. Watershed characteristics: A. mean susceptibility; B. # fill terrace cells; C. # pig disturbance only cells; D. # road crossing &amp; multiple disturbance cells; E. watershed area (km2); F. mean annual precipitation (mm); G. total annual precipitation (mm).</w:t>
       </w:r>
     </w:p>
     <w:p>
@@ -1374,6 +1429,11 @@
           <w:noProof/>
         </w:rPr>
         <w:lastRenderedPageBreak/>
+      </w:r>
+      <w:r>
+        <w:rPr>
+          <w:noProof/>
+        </w:rPr>
         <w:drawing>
           <wp:inline distT="0" distB="0" distL="0" distR="0" wp14:anchorId="09F58CBD" wp14:editId="05389A30">
             <wp:extent cx="5099050" cy="2743200"/>
@@ -1382,7 +1442,7 @@
             <wp:cNvGraphicFramePr/>
             <a:graphic xmlns:a="http://schemas.openxmlformats.org/drawingml/2006/main">
               <a:graphicData uri="http://schemas.openxmlformats.org/drawingml/2006/chart">
-                <c:chart xmlns:c="http://schemas.openxmlformats.org/drawingml/2006/chart" xmlns:r="http://schemas.openxmlformats.org/officeDocument/2006/relationships" r:id="rId24"/>
+                <c:chart xmlns:c="http://schemas.openxmlformats.org/drawingml/2006/chart" r:id="rId24"/>
               </a:graphicData>
             </a:graphic>
           </wp:inline>
@@ -1473,6 +1533,11 @@
           <w:noProof/>
         </w:rPr>
         <w:lastRenderedPageBreak/>
+      </w:r>
+      <w:r>
+        <w:rPr>
+          <w:noProof/>
+        </w:rPr>
         <w:drawing>
           <wp:inline distT="0" distB="0" distL="0" distR="0" wp14:anchorId="386B2876" wp14:editId="724EC7D4">
             <wp:extent cx="4851400" cy="2743200"/>
@@ -1481,7 +1546,7 @@
             <wp:cNvGraphicFramePr/>
             <a:graphic xmlns:a="http://schemas.openxmlformats.org/drawingml/2006/main">
               <a:graphicData uri="http://schemas.openxmlformats.org/drawingml/2006/chart">
-                <c:chart xmlns:c="http://schemas.openxmlformats.org/drawingml/2006/chart" xmlns:r="http://schemas.openxmlformats.org/officeDocument/2006/relationships" r:id="rId26"/>
+                <c:chart xmlns:c="http://schemas.openxmlformats.org/drawingml/2006/chart" r:id="rId26"/>
               </a:graphicData>
             </a:graphic>
           </wp:inline>
@@ -1572,6 +1637,11 @@
           <w:noProof/>
         </w:rPr>
         <w:lastRenderedPageBreak/>
+      </w:r>
+      <w:r>
+        <w:rPr>
+          <w:noProof/>
+        </w:rPr>
         <w:drawing>
           <wp:inline distT="0" distB="0" distL="0" distR="0" wp14:anchorId="03FC1E4A" wp14:editId="629E4D43">
             <wp:extent cx="5080000" cy="2743200"/>
@@ -1580,7 +1650,7 @@
             <wp:cNvGraphicFramePr/>
             <a:graphic xmlns:a="http://schemas.openxmlformats.org/drawingml/2006/main">
               <a:graphicData uri="http://schemas.openxmlformats.org/drawingml/2006/chart">
-                <c:chart xmlns:c="http://schemas.openxmlformats.org/drawingml/2006/chart" xmlns:r="http://schemas.openxmlformats.org/officeDocument/2006/relationships" r:id="rId28"/>
+                <c:chart xmlns:c="http://schemas.openxmlformats.org/drawingml/2006/chart" r:id="rId28"/>
               </a:graphicData>
             </a:graphic>
           </wp:inline>
@@ -2873,6 +2943,11 @@
           <w:rFonts w:asciiTheme="majorHAnsi" w:hAnsiTheme="majorHAnsi" w:cstheme="majorHAnsi"/>
         </w:rPr>
         <w:lastRenderedPageBreak/>
+      </w:r>
+      <w:r>
+        <w:rPr>
+          <w:rFonts w:asciiTheme="majorHAnsi" w:hAnsiTheme="majorHAnsi" w:cstheme="majorHAnsi"/>
+        </w:rPr>
         <w:t>Table S</w:t>
       </w:r>
       <w:bookmarkEnd w:id="2"/>
@@ -8421,6 +8496,12 @@
           <w:lang w:val="en-US"/>
         </w:rPr>
         <w:lastRenderedPageBreak/>
+      </w:r>
+      <w:r>
+        <w:rPr>
+          <w:rFonts w:asciiTheme="majorHAnsi" w:hAnsiTheme="majorHAnsi" w:cstheme="majorHAnsi"/>
+          <w:lang w:val="en-US"/>
+        </w:rPr>
         <w:t xml:space="preserve">Table S3. </w:t>
       </w:r>
       <w:r>
@@ -8437,7 +8518,7 @@
           <w:color w:val="000000" w:themeColor="text1"/>
           <w:lang w:val="haw-US"/>
         </w:rPr>
-        <w:t xml:space="preserve">in metric tons per annum (tons/yr) </w:t>
+        <w:t xml:space="preserve">in tonnes per year (tonnes/yr) from</w:t>
       </w:r>
       <w:r>
         <w:rPr>
@@ -8445,7 +8526,7 @@
           <w:color w:val="000000" w:themeColor="text1"/>
           <w:lang w:val="en-US"/>
         </w:rPr>
-        <w:t xml:space="preserve">from </w:t>
+        <w:t xml:space="preserve"> </w:t>
       </w:r>
       <w:r>
         <w:fldChar w:fldCharType="begin"/>
@@ -8620,7 +8701,7 @@
                 <w:sz w:val="18"/>
                 <w:lang w:val="en-US"/>
               </w:rPr>
-              <w:t>Estimated annual bank erosion, tons/yr</w:t>
+              <w:t xml:space="preserve">Estimated annual bank erosion, tonnes/yr</w:t>
             </w:r>
           </w:p>
         </w:tc>
@@ -8648,7 +8729,7 @@
                 <w:sz w:val="18"/>
                 <w:lang w:val="en-US"/>
               </w:rPr>
-              <w:t>Modeled, calibrated bank erosion, tons/yr</w:t>
+              <w:t xml:space="preserve">Modeled, calibrated bank erosion, tonnes/yr</w:t>
             </w:r>
           </w:p>
         </w:tc>
@@ -11233,6 +11314,12 @@
           <w:lang w:val="en-US"/>
         </w:rPr>
         <w:lastRenderedPageBreak/>
+      </w:r>
+      <w:r>
+        <w:rPr>
+          <w:rFonts w:asciiTheme="majorHAnsi" w:hAnsiTheme="majorHAnsi" w:cstheme="majorHAnsi"/>
+          <w:lang w:val="en-US"/>
+        </w:rPr>
         <w:t>Table S</w:t>
       </w:r>
       <w:bookmarkEnd w:id="3"/>
@@ -11289,7 +11376,7 @@
           <w:color w:val="000000" w:themeColor="text1"/>
           <w:lang w:val="haw-US"/>
         </w:rPr>
-        <w:t xml:space="preserve">in metric tons per hectare per annum </w:t>
+        <w:t xml:space="preserve">in tonnes per hectare per year (tonnes/ha/yr)</w:t>
       </w:r>
       <w:r>
         <w:rPr>
@@ -11297,39 +11384,7 @@
           <w:color w:val="000000" w:themeColor="text1"/>
           <w:lang w:val="en-US"/>
         </w:rPr>
-        <w:t>(</w:t>
-      </w:r>
-      <w:r>
-        <w:rPr>
-          <w:rFonts w:asciiTheme="majorHAnsi" w:hAnsiTheme="majorHAnsi" w:cstheme="majorHAnsi"/>
-          <w:color w:val="000000" w:themeColor="text1"/>
-          <w:lang w:val="haw-US"/>
-        </w:rPr>
-        <w:t>tons</w:t>
-      </w:r>
-      <w:r>
-        <w:rPr>
-          <w:rFonts w:asciiTheme="majorHAnsi" w:hAnsiTheme="majorHAnsi" w:cstheme="majorHAnsi"/>
-          <w:color w:val="000000" w:themeColor="text1"/>
-          <w:lang w:val="en-US"/>
-        </w:rPr>
-        <w:t>/</w:t>
-      </w:r>
-      <w:r>
-        <w:rPr>
-          <w:rFonts w:asciiTheme="majorHAnsi" w:hAnsiTheme="majorHAnsi" w:cstheme="majorHAnsi"/>
-          <w:color w:val="000000" w:themeColor="text1"/>
-          <w:lang w:val="haw-US"/>
-        </w:rPr>
-        <w:t>ha</w:t>
-      </w:r>
-      <w:r>
-        <w:rPr>
-          <w:rFonts w:asciiTheme="majorHAnsi" w:hAnsiTheme="majorHAnsi" w:cstheme="majorHAnsi"/>
-          <w:color w:val="000000" w:themeColor="text1"/>
-          <w:lang w:val="en-US"/>
-        </w:rPr>
-        <w:t>/yr) and associated</w:t>
+        <w:t xml:space="preserve"> and associated</w:t>
       </w:r>
       <w:r>
         <w:rPr>
@@ -11807,7 +11862,7 @@
                 <w:color w:val="000000"/>
                 <w:sz w:val="18"/>
               </w:rPr>
-              <w:t>T/ha/yr</w:t>
+              <w:t xml:space="preserve">tonnes/ha/yr</w:t>
             </w:r>
           </w:p>
         </w:tc>
@@ -14159,6 +14214,11 @@
           <w:rFonts w:asciiTheme="majorHAnsi" w:hAnsiTheme="majorHAnsi" w:cstheme="majorHAnsi"/>
         </w:rPr>
         <w:lastRenderedPageBreak/>
+      </w:r>
+      <w:r>
+        <w:rPr>
+          <w:rFonts w:asciiTheme="majorHAnsi" w:hAnsiTheme="majorHAnsi" w:cstheme="majorHAnsi"/>
+        </w:rPr>
         <w:t>Table S5</w:t>
       </w:r>
       <w:r>
@@ -14173,7 +14233,19 @@
         <w:rPr>
           <w:rFonts w:asciiTheme="majorHAnsi" w:hAnsiTheme="majorHAnsi" w:cstheme="majorHAnsi"/>
         </w:rPr>
-        <w:t xml:space="preserve"> Subwatershed characteristics. Subwatersheds are listed from north to south. Erosion is measured in metric tonnes per annum (tons/yr). Empirical model estimates (</w:t>
+        <w:t xml:space="preserve"> Subwatershed characteristics. Subwatersheds are listed from north to south. Erosion is </w:t>
+      </w:r>
+      <w:r>
+        <w:rPr>
+          <w:rFonts w:asciiTheme="majorHAnsi" w:hAnsiTheme="majorHAnsi" w:cstheme="majorHAnsi"/>
+        </w:rPr>
+        <w:t xml:space="preserve">measured in tonnes per year (tonnes/yr)</w:t>
+      </w:r>
+      <w:r>
+        <w:rPr>
+          <w:rFonts w:asciiTheme="majorHAnsi" w:hAnsiTheme="majorHAnsi" w:cstheme="majorHAnsi"/>
+        </w:rPr>
+        <w:t xml:space="preserve">. Empirical model estimates (</w:t>
       </w:r>
       <w:r>
         <w:rPr>
@@ -14292,7 +14364,7 @@
                 <w:szCs w:val="22"/>
                 <w:lang w:val="en-US"/>
               </w:rPr>
-              <w:t>Erosion (tons/yr)</w:t>
+              <w:t xml:space="preserve">Erosion (tonnes/yr)</w:t>
             </w:r>
           </w:p>
         </w:tc>
@@ -20652,6 +20724,11 @@
           <w:rStyle w:val="Strong"/>
         </w:rPr>
         <w:lastRenderedPageBreak/>
+      </w:r>
+      <w:r>
+        <w:rPr>
+          <w:rStyle w:val="Strong"/>
+        </w:rPr>
         <w:t>Data Processing</w:t>
       </w:r>
     </w:p>
@@ -21077,6 +21154,11 @@
           <w:rStyle w:val="Strong"/>
         </w:rPr>
         <w:lastRenderedPageBreak/>
+      </w:r>
+      <w:r>
+        <w:rPr>
+          <w:rStyle w:val="Strong"/>
+        </w:rPr>
         <w:t>Stream Flow Force</w:t>
       </w:r>
     </w:p>
@@ -21162,6 +21244,13 @@
           <w:lang w:val="en-US"/>
         </w:rPr>
         <w:tab/>
+      </w:r>
+      <w:r>
+        <w:rPr>
+          <w:rFonts w:asciiTheme="majorHAnsi" w:hAnsiTheme="majorHAnsi" w:cstheme="majorHAnsi"/>
+          <w:color w:val="000000" w:themeColor="text1"/>
+          <w:lang w:val="en-US"/>
+        </w:rPr>
         <w:t>(1)</w:t>
       </w:r>
     </w:p>

</xml_diff>